<commit_message>
docs(gns3): regenera manual docx con fix de apertura de proyecto (§2.3)
Co-Authored-By: Claude Opus 4.8 <noreply@anthropic.com>
</commit_message>
<xml_diff>
--- a/gns3/MANUAL_EJECUCION_GNS3.docx
+++ b/gns3/MANUAL_EJECUCION_GNS3.docx
@@ -1933,7 +1933,34 @@
           <w:color w:val="1F3564"/>
           <w:sz w:val="24"/>
         </w:rPr>
-        <w:t>Paso 2.3 — Abrir el proyecto</w:t>
+        <w:t>Paso 2.3 — Abrir el proyecto (IMPORTANTE: usar Import, no Open)</w:t>
+      </w:r>
+    </w:p>
+    <w:p>
+      <w:pPr>
+        <w:spacing w:before="40" w:after="40"/>
+        <w:ind w:left="567" w:right="567"/>
+        <w:shd w:val="clear" w:color="auto" w:fill="FFF3CD"/>
+      </w:pPr>
+      <w:r>
+        <w:rPr>
+          <w:b/>
+          <w:color w:val="856604"/>
+          <w:sz w:val="20"/>
+        </w:rPr>
+        <w:t>⚠ **No uses `File → Open project`.** Ese diálogo es el **explorador de archivos de Windows** y solo ve proyectos guardados en el disco local (`C:\Users\&lt;tu_usuario&gt;\GNS3\projects\`). El proyecto `red-team-lab` vive en la **GNS3 VM** (servidor remoto), así que **nunca aparecerá** en ese diálogo.</w:t>
+      </w:r>
+    </w:p>
+    <w:p>
+      <w:pPr>
+        <w:spacing w:before="40" w:after="80"/>
+      </w:pPr>
+      <w:r>
+        <w:rPr>
+          <w:b/>
+          <w:sz w:val="21"/>
+        </w:rPr>
+        <w:t>Vía correcta — importar el proyecto portable:</w:t>
       </w:r>
     </w:p>
     <w:p>
@@ -1946,20 +1973,20 @@
         <w:rPr>
           <w:sz w:val="21"/>
         </w:rPr>
-        <w:t xml:space="preserve">Menú </w:t>
+        <w:t xml:space="preserve">Si tienes abierto el diálogo "Open project", pulsa </w:t>
       </w:r>
       <w:r>
         <w:rPr>
           <w:b/>
           <w:sz w:val="21"/>
         </w:rPr>
-        <w:t>File → Open project…</w:t>
+        <w:t>Cancelar</w:t>
       </w:r>
       <w:r>
         <w:rPr>
           <w:sz w:val="21"/>
         </w:rPr>
-        <w:t xml:space="preserve"> (o el icono de carpeta 📂 en la barra superior).</w:t>
+        <w:t>.</w:t>
       </w:r>
     </w:p>
     <w:p>
@@ -1972,14 +1999,14 @@
         <w:rPr>
           <w:sz w:val="21"/>
         </w:rPr>
-        <w:t xml:space="preserve">Aparece el diálogo *Projects*. En la lista del servidor verás </w:t>
+        <w:t xml:space="preserve">Menú </w:t>
       </w:r>
       <w:r>
         <w:rPr>
           <w:b/>
           <w:sz w:val="21"/>
         </w:rPr>
-        <w:t>`red-team-lab`</w:t>
+        <w:t>File → Import portable project</w:t>
       </w:r>
       <w:r>
         <w:rPr>
@@ -1998,33 +2025,33 @@
         <w:rPr>
           <w:sz w:val="21"/>
         </w:rPr>
-        <w:t xml:space="preserve">Doble clic en </w:t>
+        <w:t xml:space="preserve">Navega a </w:t>
       </w:r>
       <w:r>
         <w:rPr>
           <w:b/>
           <w:sz w:val="21"/>
         </w:rPr>
-        <w:t>`red-team-lab`</w:t>
+        <w:t>`D:\Project-Red-Team\gns3\red-team-lab.gns3project`</w:t>
       </w:r>
       <w:r>
         <w:rPr>
           <w:sz w:val="21"/>
         </w:rPr>
-        <w:t xml:space="preserve"> (o selecciónalo y pulsa </w:t>
+        <w:t xml:space="preserve"> y pulsa </w:t>
       </w:r>
       <w:r>
         <w:rPr>
           <w:b/>
           <w:sz w:val="21"/>
         </w:rPr>
-        <w:t>OK</w:t>
+        <w:t>Abrir</w:t>
       </w:r>
       <w:r>
         <w:rPr>
           <w:sz w:val="21"/>
         </w:rPr>
-        <w:t>).</w:t>
+        <w:t>.</w:t>
       </w:r>
     </w:p>
     <w:p>
@@ -2037,20 +2064,162 @@
         <w:rPr>
           <w:sz w:val="21"/>
         </w:rPr>
-        <w:t xml:space="preserve">Si ya tenías otro proyecto abierto, ciérralo antes con </w:t>
+        <w:t xml:space="preserve">Cuando pregunte el nombre/servidor, deja </w:t>
       </w:r>
       <w:r>
         <w:rPr>
           <w:b/>
           <w:sz w:val="21"/>
         </w:rPr>
-        <w:t>File → Close project</w:t>
+        <w:t>`red-team-lab`</w:t>
       </w:r>
       <w:r>
         <w:rPr>
           <w:sz w:val="21"/>
         </w:rPr>
+        <w:t xml:space="preserve"> y elige el servidor </w:t>
+      </w:r>
+      <w:r>
+        <w:rPr>
+          <w:b/>
+          <w:sz w:val="21"/>
+        </w:rPr>
+        <w:t>GNS3 VM</w:t>
+      </w:r>
+      <w:r>
+        <w:rPr>
+          <w:sz w:val="21"/>
+        </w:rPr>
+        <w:t xml:space="preserve">. Pulsa </w:t>
+      </w:r>
+      <w:r>
+        <w:rPr>
+          <w:b/>
+          <w:sz w:val="21"/>
+        </w:rPr>
+        <w:t>OK</w:t>
+      </w:r>
+      <w:r>
+        <w:rPr>
+          <w:sz w:val="21"/>
+        </w:rPr>
         <w:t>.</w:t>
+      </w:r>
+    </w:p>
+    <w:p>
+      <w:pPr>
+        <w:pStyle w:val="ListNumber"/>
+        <w:spacing w:before="20" w:after="20"/>
+        <w:ind w:left="283"/>
+      </w:pPr>
+      <w:r>
+        <w:rPr>
+          <w:sz w:val="21"/>
+        </w:rPr>
+        <w:t>El proyecto se abre y el canvas muestra los 8 nodos + el switch central.</w:t>
+      </w:r>
+    </w:p>
+    <w:p>
+      <w:pPr>
+        <w:pStyle w:val="ListNumber"/>
+        <w:spacing w:before="20" w:after="20"/>
+        <w:ind w:left="283"/>
+      </w:pPr>
+      <w:r>
+        <w:rPr>
+          <w:sz w:val="21"/>
+        </w:rPr>
+        <w:t>Arranca los nodos (▶ Start, ver §3).</w:t>
+      </w:r>
+    </w:p>
+    <w:p>
+      <w:pPr>
+        <w:spacing w:before="40" w:after="40"/>
+        <w:ind w:left="567" w:right="567"/>
+        <w:shd w:val="clear" w:color="auto" w:fill="FFF3CD"/>
+      </w:pPr>
+      <w:r>
+        <w:rPr>
+          <w:b/>
+          <w:color w:val="856604"/>
+          <w:sz w:val="20"/>
+        </w:rPr>
+        <w:t>⚠ El archivo `.gns3project` se regenera en cualquier momento desde Windows:</w:t>
+      </w:r>
+    </w:p>
+    <w:p>
+      <w:pPr>
+        <w:spacing w:before="40" w:after="40"/>
+        <w:ind w:left="567" w:right="567"/>
+        <w:shd w:val="clear" w:color="auto" w:fill="FFF3CD"/>
+      </w:pPr>
+      <w:r>
+        <w:rPr>
+          <w:b/>
+          <w:color w:val="856604"/>
+          <w:sz w:val="20"/>
+        </w:rPr>
+        <w:t>⚠ ```powershell</w:t>
+      </w:r>
+    </w:p>
+    <w:p>
+      <w:pPr>
+        <w:spacing w:before="40" w:after="40"/>
+        <w:ind w:left="567" w:right="567"/>
+        <w:shd w:val="clear" w:color="auto" w:fill="FFF3CD"/>
+      </w:pPr>
+      <w:r>
+        <w:rPr>
+          <w:b/>
+          <w:color w:val="856604"/>
+          <w:sz w:val="20"/>
+        </w:rPr>
+        <w:t>⚠ $base="http://192.168.116.128/v2"; $p="be75d0fb-1988-48cd-8cef-55dfa91c8aba"</w:t>
+      </w:r>
+    </w:p>
+    <w:p>
+      <w:pPr>
+        <w:spacing w:before="40" w:after="40"/>
+        <w:ind w:left="567" w:right="567"/>
+        <w:shd w:val="clear" w:color="auto" w:fill="FFF3CD"/>
+      </w:pPr>
+      <w:r>
+        <w:rPr>
+          <w:b/>
+          <w:color w:val="856604"/>
+          <w:sz w:val="20"/>
+        </w:rPr>
+        <w:t>⚠ Invoke-RestMethod "$base/projects/$p/close" -Method Post -ContentType "application/json" -Body "{}"</w:t>
+      </w:r>
+    </w:p>
+    <w:p>
+      <w:pPr>
+        <w:spacing w:before="40" w:after="40"/>
+        <w:ind w:left="567" w:right="567"/>
+        <w:shd w:val="clear" w:color="auto" w:fill="FFF3CD"/>
+      </w:pPr>
+      <w:r>
+        <w:rPr>
+          <w:b/>
+          <w:color w:val="856604"/>
+          <w:sz w:val="20"/>
+        </w:rPr>
+        <w:t>⚠ Invoke-WebRequest "$base/projects/$p/export?include_images=no" -OutFile D:\Project-Red-Team\gns3\red-team-lab.gns3project</w:t>
+      </w:r>
+    </w:p>
+    <w:p>
+      <w:pPr>
+        <w:spacing w:before="40" w:after="40"/>
+        <w:ind w:left="567" w:right="567"/>
+        <w:shd w:val="clear" w:color="auto" w:fill="FFF3CD"/>
+      </w:pPr>
+      <w:r>
+        <w:rPr>
+          <w:b/>
+          <w:color w:val="856604"/>
+          <w:sz w:val="20"/>
+        </w:rPr>
+        <w:t>⚠ ```</w:t>
       </w:r>
     </w:p>
     <w:p>

</xml_diff>

<commit_message>
docs(gns3): añade escenario multi-equipo (otra PC en la misma red)
Nueva seccion §11 del manual de ejecucion: como otra computadora en la
misma WiFi/LAN participa en el lab. Documenta las 3 capas de red (WiFi
fisica / host-only VMnet3 / topologia interna 172.20.0.0/24) y por que
no es accesible por defecto. Tres metodos segun objetivo:
- §11.2 Bridged + GNS3 GUI remoto (colaborar en la misma topologia)
- §11.3 Cloud node (atacante externo real con su propio Kali)
- §11.4 Port forwarding desde Windows (exponer API/servicio puntual)

Basado en la red real verificada: host Wi-Fi 192.168.1.3, GNS3 VM
192.168.116.128 en VMnet3 host-only.

Co-Authored-By: Claude Opus 4.8 <noreply@anthropic.com>
</commit_message>
<xml_diff>
--- a/gns3/MANUAL_EJECUCION_GNS3.docx
+++ b/gns3/MANUAL_EJECUCION_GNS3.docx
@@ -248,6 +248,19 @@
           <w:sz w:val="21"/>
         </w:rPr>
         <w:t>[Solución de problemas](#10-solución-de-problemas)</w:t>
+      </w:r>
+    </w:p>
+    <w:p>
+      <w:pPr>
+        <w:pStyle w:val="ListNumber"/>
+        <w:spacing w:before="20" w:after="20"/>
+        <w:ind w:left="283"/>
+      </w:pPr>
+      <w:r>
+        <w:rPr>
+          <w:sz w:val="21"/>
+        </w:rPr>
+        <w:t>[Escenario multi-equipo (otra PC en la misma red)](#11-escenario-multi-equipo-otra-pc-en-la-misma-red)</w:t>
       </w:r>
     </w:p>
     <w:p>
@@ -5542,6 +5555,1600 @@
           <w:color w:val="1F3564"/>
           <w:sz w:val="28"/>
         </w:rPr>
+        <w:t>11. Escenario multi-equipo (otra PC en la misma red)</w:t>
+      </w:r>
+    </w:p>
+    <w:p>
+      <w:pPr>
+        <w:pBdr>
+          <w:bottom w:val="single" w:sz="6" w:space="1" w:color="1F3564"/>
+        </w:pBdr>
+        <w:spacing w:after="80"/>
+      </w:pPr>
+    </w:p>
+    <w:p>
+      <w:pPr>
+        <w:spacing w:before="40" w:after="80"/>
+      </w:pPr>
+      <w:r>
+        <w:rPr>
+          <w:sz w:val="21"/>
+        </w:rPr>
+        <w:t xml:space="preserve">Escenario realista: </w:t>
+      </w:r>
+      <w:r>
+        <w:rPr>
+          <w:b/>
+          <w:sz w:val="21"/>
+        </w:rPr>
+        <w:t>otro integrante del equipo, en otra computadora de la misma red WiFi/LAN</w:t>
+      </w:r>
+      <w:r>
+        <w:rPr>
+          <w:sz w:val="21"/>
+        </w:rPr>
+        <w:t xml:space="preserve">, participa en el laboratorio (opera la topología o ataca los servicios). Por defecto </w:t>
+      </w:r>
+      <w:r>
+        <w:rPr>
+          <w:b/>
+          <w:sz w:val="21"/>
+        </w:rPr>
+        <w:t>no es posible</w:t>
+      </w:r>
+      <w:r>
+        <w:rPr>
+          <w:sz w:val="21"/>
+        </w:rPr>
+        <w:t xml:space="preserve"> por cómo están aisladas las redes. Esta sección explica por qué y cómo habilitarlo.</w:t>
+      </w:r>
+    </w:p>
+    <w:p>
+      <w:pPr>
+        <w:pStyle w:val="Heading2"/>
+        <w:spacing w:before="200" w:after="40"/>
+      </w:pPr>
+      <w:r>
+        <w:rPr>
+          <w:rFonts w:ascii="Calibri" w:hAnsi="Calibri"/>
+          <w:b/>
+          <w:color w:val="1F3564"/>
+          <w:sz w:val="24"/>
+        </w:rPr>
+        <w:t>11.1 Las tres capas de red (por qué no es accesible por defecto)</w:t>
+      </w:r>
+    </w:p>
+    <w:p>
+      <w:pPr>
+        <w:spacing w:before="0" w:after="0"/>
+        <w:ind w:left="283"/>
+        <w:shd w:val="clear" w:color="auto" w:fill="F2F2F2"/>
+      </w:pPr>
+      <w:r>
+        <w:rPr>
+          <w:rFonts w:ascii="Courier New" w:hAnsi="Courier New"/>
+          <w:color w:val="1A1A1A"/>
+          <w:sz w:val="17"/>
+        </w:rPr>
+        <w:t>[ Otra PC del equipo ]        192.168.1.x        ← red WiFi/LAN fisica</w:t>
+      </w:r>
+    </w:p>
+    <w:p>
+      <w:pPr>
+        <w:spacing w:before="0" w:after="0"/>
+        <w:ind w:left="283"/>
+        <w:shd w:val="clear" w:color="auto" w:fill="F2F2F2"/>
+      </w:pPr>
+      <w:r>
+        <w:rPr>
+          <w:rFonts w:ascii="Courier New" w:hAnsi="Courier New"/>
+          <w:color w:val="1A1A1A"/>
+          <w:sz w:val="17"/>
+        </w:rPr>
+        <w:t xml:space="preserve">        │ (192.168.1.0/24)</w:t>
+      </w:r>
+    </w:p>
+    <w:p>
+      <w:pPr>
+        <w:spacing w:before="0" w:after="0"/>
+        <w:ind w:left="283"/>
+        <w:shd w:val="clear" w:color="auto" w:fill="F2F2F2"/>
+      </w:pPr>
+      <w:r>
+        <w:rPr>
+          <w:rFonts w:ascii="Courier New" w:hAnsi="Courier New"/>
+          <w:color w:val="1A1A1A"/>
+          <w:sz w:val="17"/>
+        </w:rPr>
+        <w:t>[ Tu PC (Windows) ]           192.168.1.3 (Wi-Fi) + 192.168.116.1 (VMnet3)</w:t>
+      </w:r>
+    </w:p>
+    <w:p>
+      <w:pPr>
+        <w:spacing w:before="0" w:after="0"/>
+        <w:ind w:left="283"/>
+        <w:shd w:val="clear" w:color="auto" w:fill="F2F2F2"/>
+      </w:pPr>
+      <w:r>
+        <w:rPr>
+          <w:rFonts w:ascii="Courier New" w:hAnsi="Courier New"/>
+          <w:color w:val="1A1A1A"/>
+          <w:sz w:val="17"/>
+        </w:rPr>
+        <w:t xml:space="preserve">        │ (red host-only VMware VMnet3, 192.168.116.0/24)</w:t>
+      </w:r>
+    </w:p>
+    <w:p>
+      <w:pPr>
+        <w:spacing w:before="0" w:after="0"/>
+        <w:ind w:left="283"/>
+        <w:shd w:val="clear" w:color="auto" w:fill="F2F2F2"/>
+      </w:pPr>
+      <w:r>
+        <w:rPr>
+          <w:rFonts w:ascii="Courier New" w:hAnsi="Courier New"/>
+          <w:color w:val="1A1A1A"/>
+          <w:sz w:val="17"/>
+        </w:rPr>
+        <w:t>[ GNS3 VM ]                   192.168.116.128</w:t>
+      </w:r>
+    </w:p>
+    <w:p>
+      <w:pPr>
+        <w:spacing w:before="0" w:after="0"/>
+        <w:ind w:left="283"/>
+        <w:shd w:val="clear" w:color="auto" w:fill="F2F2F2"/>
+      </w:pPr>
+      <w:r>
+        <w:rPr>
+          <w:rFonts w:ascii="Courier New" w:hAnsi="Courier New"/>
+          <w:color w:val="1A1A1A"/>
+          <w:sz w:val="17"/>
+        </w:rPr>
+        <w:t xml:space="preserve">        │ (switch virtual GNS3, interno a la VM)</w:t>
+      </w:r>
+    </w:p>
+    <w:p>
+      <w:pPr>
+        <w:spacing w:before="0" w:after="0"/>
+        <w:ind w:left="283"/>
+        <w:shd w:val="clear" w:color="auto" w:fill="F2F2F2"/>
+      </w:pPr>
+      <w:r>
+        <w:rPr>
+          <w:rFonts w:ascii="Courier New" w:hAnsi="Courier New"/>
+          <w:color w:val="1A1A1A"/>
+          <w:sz w:val="17"/>
+        </w:rPr>
+        <w:t>[ Topología ]                 172.20.0.0/24  (Kali, bt-web, bt-dns, ...)</w:t>
+      </w:r>
+    </w:p>
+    <w:p>
+      <w:pPr>
+        <w:spacing w:before="0" w:after="80"/>
+      </w:pPr>
+    </w:p>
+    <w:p>
+      <w:pPr>
+        <w:pStyle w:val="ListBullet"/>
+        <w:spacing w:before="20" w:after="20"/>
+        <w:ind w:left="283"/>
+      </w:pPr>
+      <w:r>
+        <w:rPr>
+          <w:sz w:val="21"/>
+        </w:rPr>
+        <w:t xml:space="preserve">La </w:t>
+      </w:r>
+      <w:r>
+        <w:rPr>
+          <w:b/>
+          <w:sz w:val="21"/>
+        </w:rPr>
+        <w:t>GNS3 VM</w:t>
+      </w:r>
+      <w:r>
+        <w:rPr>
+          <w:sz w:val="21"/>
+        </w:rPr>
+        <w:t xml:space="preserve"> está en </w:t>
+      </w:r>
+      <w:r>
+        <w:rPr>
+          <w:b/>
+          <w:sz w:val="21"/>
+        </w:rPr>
+        <w:t>VMnet3 (host-only)</w:t>
+      </w:r>
+      <w:r>
+        <w:rPr>
+          <w:sz w:val="21"/>
+        </w:rPr>
+        <w:t xml:space="preserve">: solo tu PC Windows la ve. Otra PC en la WiFi </w:t>
+      </w:r>
+      <w:r>
+        <w:rPr>
+          <w:b/>
+          <w:sz w:val="21"/>
+        </w:rPr>
+        <w:t>no alcanza</w:t>
+      </w:r>
+      <w:r>
+        <w:rPr>
+          <w:sz w:val="21"/>
+        </w:rPr>
+        <w:t xml:space="preserve"> </w:t>
+      </w:r>
+      <w:r>
+        <w:rPr>
+          <w:rFonts w:ascii="Courier New" w:hAnsi="Courier New"/>
+          <w:color w:val="C00000"/>
+          <w:sz w:val="21"/>
+        </w:rPr>
+        <w:t>192.168.116.128</w:t>
+      </w:r>
+      <w:r>
+        <w:rPr>
+          <w:sz w:val="21"/>
+        </w:rPr>
+        <w:t>.</w:t>
+      </w:r>
+    </w:p>
+    <w:p>
+      <w:pPr>
+        <w:pStyle w:val="ListBullet"/>
+        <w:spacing w:before="20" w:after="20"/>
+        <w:ind w:left="283"/>
+      </w:pPr>
+      <w:r>
+        <w:rPr>
+          <w:sz w:val="21"/>
+        </w:rPr>
+        <w:t xml:space="preserve">La </w:t>
+      </w:r>
+      <w:r>
+        <w:rPr>
+          <w:b/>
+          <w:sz w:val="21"/>
+        </w:rPr>
+        <w:t>red de la topología</w:t>
+      </w:r>
+      <w:r>
+        <w:rPr>
+          <w:sz w:val="21"/>
+        </w:rPr>
+        <w:t xml:space="preserve"> (</w:t>
+      </w:r>
+      <w:r>
+        <w:rPr>
+          <w:rFonts w:ascii="Courier New" w:hAnsi="Courier New"/>
+          <w:color w:val="C00000"/>
+          <w:sz w:val="21"/>
+        </w:rPr>
+        <w:t>172.20.0.0/24</w:t>
+      </w:r>
+      <w:r>
+        <w:rPr>
+          <w:sz w:val="21"/>
+        </w:rPr>
+        <w:t xml:space="preserve">) vive en el </w:t>
+      </w:r>
+      <w:r>
+        <w:rPr>
+          <w:b/>
+          <w:sz w:val="21"/>
+        </w:rPr>
+        <w:t>switch virtual de GNS3</w:t>
+      </w:r>
+      <w:r>
+        <w:rPr>
+          <w:sz w:val="21"/>
+        </w:rPr>
+        <w:t>, interno a la VM: ni siquiera tu PC Windows la alcanza directamente.</w:t>
+      </w:r>
+    </w:p>
+    <w:p>
+      <w:pPr>
+        <w:spacing w:before="40" w:after="80"/>
+      </w:pPr>
+      <w:r>
+        <w:rPr>
+          <w:sz w:val="21"/>
+        </w:rPr>
+        <w:t>Hay que tender un puente. El método depende del objetivo.</w:t>
+      </w:r>
+    </w:p>
+    <w:p>
+      <w:pPr>
+        <w:spacing w:before="40" w:after="40"/>
+        <w:ind w:left="567" w:right="567"/>
+        <w:shd w:val="clear" w:color="auto" w:fill="FFF3CD"/>
+      </w:pPr>
+      <w:r>
+        <w:rPr>
+          <w:b/>
+          <w:color w:val="856604"/>
+          <w:sz w:val="20"/>
+        </w:rPr>
+        <w:t>⚠ Sustituye las IPs por las tuyas: tu Wi-Fi es `192.168.1.3`, la GNS3 VM `192.168.116.128`. Confírmalas con `ipconfig` (Windows) y la pantalla de la VM.</w:t>
+      </w:r>
+    </w:p>
+    <w:p>
+      <w:pPr>
+        <w:pStyle w:val="Heading2"/>
+        <w:spacing w:before="200" w:after="40"/>
+      </w:pPr>
+      <w:r>
+        <w:rPr>
+          <w:rFonts w:ascii="Calibri" w:hAnsi="Calibri"/>
+          <w:b/>
+          <w:color w:val="1F3564"/>
+          <w:sz w:val="24"/>
+        </w:rPr>
+        <w:t>11.2 Objetivo A (recomendado) — Otra PC OPERA la misma topología (GNS3 GUI remoto)</w:t>
+      </w:r>
+    </w:p>
+    <w:p>
+      <w:pPr>
+        <w:spacing w:before="40" w:after="80"/>
+      </w:pPr>
+      <w:r>
+        <w:rPr>
+          <w:sz w:val="21"/>
+        </w:rPr>
+        <w:t xml:space="preserve">Dos integrantes ven y controlan la </w:t>
+      </w:r>
+      <w:r>
+        <w:rPr>
+          <w:b/>
+          <w:sz w:val="21"/>
+        </w:rPr>
+        <w:t>misma</w:t>
+      </w:r>
+      <w:r>
+        <w:rPr>
+          <w:sz w:val="21"/>
+        </w:rPr>
+        <w:t xml:space="preserve"> topología en tiempo real. El Kali y los targets siguen en la VM; cada quien abre consolas y lanza ataques desde su propio GNS3 GUI. Es el escenario multi-equipo más simple y robusto.</w:t>
+      </w:r>
+    </w:p>
+    <w:p>
+      <w:pPr>
+        <w:spacing w:before="40" w:after="80"/>
+      </w:pPr>
+      <w:r>
+        <w:rPr>
+          <w:b/>
+          <w:sz w:val="21"/>
+        </w:rPr>
+        <w:t>Paso 1 — Hacer la GNS3 VM accesible desde la WiFi (modo Bridged):</w:t>
+      </w:r>
+    </w:p>
+    <w:p>
+      <w:pPr>
+        <w:pStyle w:val="ListNumber"/>
+        <w:spacing w:before="20" w:after="20"/>
+        <w:ind w:left="283"/>
+      </w:pPr>
+      <w:r>
+        <w:rPr>
+          <w:sz w:val="21"/>
+        </w:rPr>
+        <w:t>Apaga la GNS3 VM (o detén los nodos y ciérrala).</w:t>
+      </w:r>
+    </w:p>
+    <w:p>
+      <w:pPr>
+        <w:pStyle w:val="ListNumber"/>
+        <w:spacing w:before="20" w:after="20"/>
+        <w:ind w:left="283"/>
+      </w:pPr>
+      <w:r>
+        <w:rPr>
+          <w:sz w:val="21"/>
+        </w:rPr>
+        <w:t xml:space="preserve">VMware Workstation → selecciona </w:t>
+      </w:r>
+      <w:r>
+        <w:rPr>
+          <w:b/>
+          <w:sz w:val="21"/>
+        </w:rPr>
+        <w:t>GNS3-VM</w:t>
+      </w:r>
+      <w:r>
+        <w:rPr>
+          <w:sz w:val="21"/>
+        </w:rPr>
+        <w:t xml:space="preserve"> → </w:t>
+      </w:r>
+      <w:r>
+        <w:rPr>
+          <w:b/>
+          <w:sz w:val="21"/>
+        </w:rPr>
+        <w:t>Edit virtual machine settings</w:t>
+      </w:r>
+      <w:r>
+        <w:rPr>
+          <w:sz w:val="21"/>
+        </w:rPr>
+        <w:t xml:space="preserve"> → </w:t>
+      </w:r>
+      <w:r>
+        <w:rPr>
+          <w:b/>
+          <w:sz w:val="21"/>
+        </w:rPr>
+        <w:t>Network Adapter</w:t>
+      </w:r>
+      <w:r>
+        <w:rPr>
+          <w:sz w:val="21"/>
+        </w:rPr>
+        <w:t xml:space="preserve"> (el de VMnet3).</w:t>
+      </w:r>
+    </w:p>
+    <w:p>
+      <w:pPr>
+        <w:pStyle w:val="ListNumber"/>
+        <w:spacing w:before="20" w:after="20"/>
+        <w:ind w:left="283"/>
+      </w:pPr>
+      <w:r>
+        <w:rPr>
+          <w:sz w:val="21"/>
+        </w:rPr>
+        <w:t xml:space="preserve">Cambia a </w:t>
+      </w:r>
+      <w:r>
+        <w:rPr>
+          <w:b/>
+          <w:sz w:val="21"/>
+        </w:rPr>
+        <w:t>Bridged (Automatic)</w:t>
+      </w:r>
+      <w:r>
+        <w:rPr>
+          <w:sz w:val="21"/>
+        </w:rPr>
+        <w:t xml:space="preserve"> → marca </w:t>
+      </w:r>
+      <w:r>
+        <w:rPr>
+          <w:b/>
+          <w:sz w:val="21"/>
+        </w:rPr>
+        <w:t>Replicate physical network connection state</w:t>
+      </w:r>
+      <w:r>
+        <w:rPr>
+          <w:sz w:val="21"/>
+        </w:rPr>
+        <w:t xml:space="preserve">. (Alternativa: </w:t>
+      </w:r>
+      <w:r>
+        <w:rPr>
+          <w:b/>
+          <w:sz w:val="21"/>
+        </w:rPr>
+        <w:t>Add</w:t>
+      </w:r>
+      <w:r>
+        <w:rPr>
+          <w:sz w:val="21"/>
+        </w:rPr>
+        <w:t xml:space="preserve"> un tercer adaptador en Bridged y deja VMnet3.)</w:t>
+      </w:r>
+    </w:p>
+    <w:p>
+      <w:pPr>
+        <w:pStyle w:val="ListNumber"/>
+        <w:spacing w:before="20" w:after="20"/>
+        <w:ind w:left="283"/>
+      </w:pPr>
+      <w:r>
+        <w:rPr>
+          <w:sz w:val="21"/>
+        </w:rPr>
+        <w:t xml:space="preserve">Arranca la VM. Ahora obtiene una IP </w:t>
+      </w:r>
+      <w:r>
+        <w:rPr>
+          <w:b/>
+          <w:sz w:val="21"/>
+        </w:rPr>
+        <w:t>de la WiFi</w:t>
+      </w:r>
+      <w:r>
+        <w:rPr>
+          <w:sz w:val="21"/>
+        </w:rPr>
+        <w:t xml:space="preserve"> (ej. </w:t>
+      </w:r>
+      <w:r>
+        <w:rPr>
+          <w:rFonts w:ascii="Courier New" w:hAnsi="Courier New"/>
+          <w:color w:val="C00000"/>
+          <w:sz w:val="21"/>
+        </w:rPr>
+        <w:t>192.168.1.50</w:t>
+      </w:r>
+      <w:r>
+        <w:rPr>
+          <w:sz w:val="21"/>
+        </w:rPr>
+        <w:t>). Anótala de la pantalla de la VM.</w:t>
+      </w:r>
+    </w:p>
+    <w:p>
+      <w:pPr>
+        <w:pStyle w:val="ListNumber"/>
+        <w:spacing w:before="20" w:after="20"/>
+        <w:ind w:left="283"/>
+      </w:pPr>
+      <w:r>
+        <w:rPr>
+          <w:sz w:val="21"/>
+        </w:rPr>
+        <w:t xml:space="preserve">Desde otra PC, comprueba: </w:t>
+      </w:r>
+      <w:r>
+        <w:rPr>
+          <w:rFonts w:ascii="Courier New" w:hAnsi="Courier New"/>
+          <w:color w:val="C00000"/>
+          <w:sz w:val="21"/>
+        </w:rPr>
+        <w:t>ping 192.168.1.50</w:t>
+      </w:r>
+      <w:r>
+        <w:rPr>
+          <w:sz w:val="21"/>
+        </w:rPr>
+        <w:t>.</w:t>
+      </w:r>
+    </w:p>
+    <w:p>
+      <w:pPr>
+        <w:spacing w:before="40" w:after="40"/>
+        <w:ind w:left="567" w:right="567"/>
+        <w:shd w:val="clear" w:color="auto" w:fill="FFF3CD"/>
+      </w:pPr>
+      <w:r>
+        <w:rPr>
+          <w:b/>
+          <w:color w:val="856604"/>
+          <w:sz w:val="20"/>
+        </w:rPr>
+        <w:t>⚠ Bridged **cambia la IP de la GNS3 VM**. Actualiza esa IP en todos los comandos de este manual (API `http://&lt;nueva_ip&gt;/v2`, `plink ... gns3@&lt;nueva_ip&gt;`).</w:t>
+      </w:r>
+    </w:p>
+    <w:p>
+      <w:pPr>
+        <w:spacing w:before="40" w:after="80"/>
+      </w:pPr>
+      <w:r>
+        <w:rPr>
+          <w:b/>
+          <w:sz w:val="21"/>
+        </w:rPr>
+        <w:t>Paso 2 — Configurar el GNS3 GUI de la otra PC:</w:t>
+      </w:r>
+    </w:p>
+    <w:p>
+      <w:pPr>
+        <w:pStyle w:val="ListNumber"/>
+        <w:spacing w:before="20" w:after="20"/>
+        <w:ind w:left="283"/>
+      </w:pPr>
+      <w:r>
+        <w:rPr>
+          <w:sz w:val="21"/>
+        </w:rPr>
+        <w:t xml:space="preserve">En la otra PC instala </w:t>
+      </w:r>
+      <w:r>
+        <w:rPr>
+          <w:b/>
+          <w:sz w:val="21"/>
+        </w:rPr>
+        <w:t>GNS3 GUI</w:t>
+      </w:r>
+      <w:r>
+        <w:rPr>
+          <w:sz w:val="21"/>
+        </w:rPr>
+        <w:t xml:space="preserve"> (misma versión: 2.2.59).</w:t>
+      </w:r>
+    </w:p>
+    <w:p>
+      <w:pPr>
+        <w:pStyle w:val="ListNumber"/>
+        <w:spacing w:before="20" w:after="20"/>
+        <w:ind w:left="283"/>
+      </w:pPr>
+      <w:r>
+        <w:rPr>
+          <w:b/>
+          <w:sz w:val="21"/>
+        </w:rPr>
+        <w:t>Edit → Preferences → Server</w:t>
+      </w:r>
+      <w:r>
+        <w:rPr>
+          <w:sz w:val="21"/>
+        </w:rPr>
+        <w:t xml:space="preserve"> → desmarca *Enable local server* → en *Main server* pon </w:t>
+      </w:r>
+      <w:r>
+        <w:rPr>
+          <w:b/>
+          <w:sz w:val="21"/>
+        </w:rPr>
+        <w:t>Host = `192.168.1.50`</w:t>
+      </w:r>
+      <w:r>
+        <w:rPr>
+          <w:sz w:val="21"/>
+        </w:rPr>
+        <w:t xml:space="preserve">, </w:t>
+      </w:r>
+      <w:r>
+        <w:rPr>
+          <w:b/>
+          <w:sz w:val="21"/>
+        </w:rPr>
+        <w:t>Port = 80</w:t>
+      </w:r>
+      <w:r>
+        <w:rPr>
+          <w:sz w:val="21"/>
+        </w:rPr>
+        <w:t xml:space="preserve">, sin autenticación → </w:t>
+      </w:r>
+      <w:r>
+        <w:rPr>
+          <w:b/>
+          <w:sz w:val="21"/>
+        </w:rPr>
+        <w:t>OK</w:t>
+      </w:r>
+      <w:r>
+        <w:rPr>
+          <w:sz w:val="21"/>
+        </w:rPr>
+        <w:t>.</w:t>
+      </w:r>
+    </w:p>
+    <w:p>
+      <w:pPr>
+        <w:pStyle w:val="ListNumber"/>
+        <w:spacing w:before="20" w:after="20"/>
+        <w:ind w:left="283"/>
+      </w:pPr>
+      <w:r>
+        <w:rPr>
+          <w:b/>
+          <w:sz w:val="21"/>
+        </w:rPr>
+        <w:t>File → Import portable project</w:t>
+      </w:r>
+      <w:r>
+        <w:rPr>
+          <w:sz w:val="21"/>
+        </w:rPr>
+        <w:t xml:space="preserve"> → usa </w:t>
+      </w:r>
+      <w:r>
+        <w:rPr>
+          <w:rFonts w:ascii="Courier New" w:hAnsi="Courier New"/>
+          <w:color w:val="C00000"/>
+          <w:sz w:val="21"/>
+        </w:rPr>
+        <w:t>red-team-lab.gns3project</w:t>
+      </w:r>
+      <w:r>
+        <w:rPr>
+          <w:sz w:val="21"/>
+        </w:rPr>
+        <w:t xml:space="preserve"> (cópialo a la otra PC), o si tu PC ya lo tiene abierto en el servidor, aparecerá al conectar.</w:t>
+      </w:r>
+    </w:p>
+    <w:p>
+      <w:pPr>
+        <w:pStyle w:val="ListNumber"/>
+        <w:spacing w:before="20" w:after="20"/>
+        <w:ind w:left="283"/>
+      </w:pPr>
+      <w:r>
+        <w:rPr>
+          <w:sz w:val="21"/>
+        </w:rPr>
+        <w:t>Ambos GUIs apuntan al mismo servidor: cualquiera arranca nodos, abre consolas (doble clic en Kali) y ejecuta las fases/DoS. Los cambios se ven en ambas pantallas.</w:t>
+      </w:r>
+    </w:p>
+    <w:p>
+      <w:pPr>
+        <w:pStyle w:val="Heading2"/>
+        <w:spacing w:before="200" w:after="40"/>
+      </w:pPr>
+      <w:r>
+        <w:rPr>
+          <w:rFonts w:ascii="Calibri" w:hAnsi="Calibri"/>
+          <w:b/>
+          <w:color w:val="1F3564"/>
+          <w:sz w:val="24"/>
+        </w:rPr>
+        <w:t>11.3 Objetivo B (avanzado) — Otra PC ATACA los servicios desde afuera (Red Team externo real)</w:t>
+      </w:r>
+    </w:p>
+    <w:p>
+      <w:pPr>
+        <w:spacing w:before="40" w:after="80"/>
+      </w:pPr>
+      <w:r>
+        <w:rPr>
+          <w:sz w:val="21"/>
+        </w:rPr>
+        <w:t xml:space="preserve">Aquí la otra PC usa </w:t>
+      </w:r>
+      <w:r>
+        <w:rPr>
+          <w:b/>
+          <w:sz w:val="21"/>
+        </w:rPr>
+        <w:t>su propio Kali/navegador</w:t>
+      </w:r>
+      <w:r>
+        <w:rPr>
+          <w:sz w:val="21"/>
+        </w:rPr>
+        <w:t xml:space="preserve"> para atacar </w:t>
+      </w:r>
+      <w:r>
+        <w:rPr>
+          <w:rFonts w:ascii="Courier New" w:hAnsi="Courier New"/>
+          <w:color w:val="C00000"/>
+          <w:sz w:val="21"/>
+        </w:rPr>
+        <w:t>bt-web</w:t>
+      </w:r>
+      <w:r>
+        <w:rPr>
+          <w:sz w:val="21"/>
+        </w:rPr>
+        <w:t xml:space="preserve"> y compañía. Requiere sacar la red </w:t>
+      </w:r>
+      <w:r>
+        <w:rPr>
+          <w:rFonts w:ascii="Courier New" w:hAnsi="Courier New"/>
+          <w:color w:val="C00000"/>
+          <w:sz w:val="21"/>
+        </w:rPr>
+        <w:t>172.20.0.0/24</w:t>
+      </w:r>
+      <w:r>
+        <w:rPr>
+          <w:sz w:val="21"/>
+        </w:rPr>
+        <w:t xml:space="preserve"> de GNS3 hacia la red física mediante un </w:t>
+      </w:r>
+      <w:r>
+        <w:rPr>
+          <w:b/>
+          <w:sz w:val="21"/>
+        </w:rPr>
+        <w:t>nodo Cloud</w:t>
+      </w:r>
+      <w:r>
+        <w:rPr>
+          <w:sz w:val="21"/>
+        </w:rPr>
+        <w:t xml:space="preserve"> (puente L2 de GNS3 a una interfaz de la VM).</w:t>
+      </w:r>
+    </w:p>
+    <w:p>
+      <w:pPr>
+        <w:pStyle w:val="ListNumber"/>
+        <w:spacing w:before="20" w:after="20"/>
+        <w:ind w:left="283"/>
+      </w:pPr>
+      <w:r>
+        <w:rPr>
+          <w:sz w:val="21"/>
+        </w:rPr>
+        <w:t xml:space="preserve">En GNS3 GUI, arrastra un nodo </w:t>
+      </w:r>
+      <w:r>
+        <w:rPr>
+          <w:b/>
+          <w:sz w:val="21"/>
+        </w:rPr>
+        <w:t>Cloud</w:t>
+      </w:r>
+      <w:r>
+        <w:rPr>
+          <w:sz w:val="21"/>
+        </w:rPr>
+        <w:t xml:space="preserve"> al canvas.</w:t>
+      </w:r>
+    </w:p>
+    <w:p>
+      <w:pPr>
+        <w:pStyle w:val="ListNumber"/>
+        <w:spacing w:before="20" w:after="20"/>
+        <w:ind w:left="283"/>
+      </w:pPr>
+      <w:r>
+        <w:rPr>
+          <w:sz w:val="21"/>
+        </w:rPr>
+        <w:t xml:space="preserve">Conéctalo con un cable al </w:t>
+      </w:r>
+      <w:r>
+        <w:rPr>
+          <w:b/>
+          <w:sz w:val="21"/>
+        </w:rPr>
+        <w:t>Switch-Central</w:t>
+      </w:r>
+      <w:r>
+        <w:rPr>
+          <w:sz w:val="21"/>
+        </w:rPr>
+        <w:t xml:space="preserve"> (a un puerto libre, ej. Ethernet8).</w:t>
+      </w:r>
+    </w:p>
+    <w:p>
+      <w:pPr>
+        <w:pStyle w:val="ListNumber"/>
+        <w:spacing w:before="20" w:after="20"/>
+        <w:ind w:left="283"/>
+      </w:pPr>
+      <w:r>
+        <w:rPr>
+          <w:sz w:val="21"/>
+        </w:rPr>
+        <w:t xml:space="preserve">Doble clic en el Cloud → pestaña de interfaces → selecciona la interfaz de la VM que esté en </w:t>
+      </w:r>
+      <w:r>
+        <w:rPr>
+          <w:b/>
+          <w:sz w:val="21"/>
+        </w:rPr>
+        <w:t>Bridged</w:t>
+      </w:r>
+      <w:r>
+        <w:rPr>
+          <w:sz w:val="21"/>
+        </w:rPr>
+        <w:t xml:space="preserve"> a la WiFi (la del Paso 1 de §11.2).</w:t>
+      </w:r>
+    </w:p>
+    <w:p>
+      <w:pPr>
+        <w:pStyle w:val="ListNumber"/>
+        <w:spacing w:before="20" w:after="20"/>
+        <w:ind w:left="283"/>
+      </w:pPr>
+      <w:r>
+        <w:rPr>
+          <w:sz w:val="21"/>
+        </w:rPr>
+        <w:t xml:space="preserve">Inicia el Cloud. Ahora el segmento </w:t>
+      </w:r>
+      <w:r>
+        <w:rPr>
+          <w:rFonts w:ascii="Courier New" w:hAnsi="Courier New"/>
+          <w:color w:val="C00000"/>
+          <w:sz w:val="21"/>
+        </w:rPr>
+        <w:t>172.20.0.0/24</w:t>
+      </w:r>
+      <w:r>
+        <w:rPr>
+          <w:sz w:val="21"/>
+        </w:rPr>
+        <w:t xml:space="preserve"> queda </w:t>
+      </w:r>
+      <w:r>
+        <w:rPr>
+          <w:b/>
+          <w:sz w:val="21"/>
+        </w:rPr>
+        <w:t>puenteado</w:t>
+      </w:r>
+      <w:r>
+        <w:rPr>
+          <w:sz w:val="21"/>
+        </w:rPr>
+        <w:t xml:space="preserve"> a la WiFi a nivel L2.</w:t>
+      </w:r>
+    </w:p>
+    <w:p>
+      <w:pPr>
+        <w:pStyle w:val="ListNumber"/>
+        <w:spacing w:before="20" w:after="20"/>
+        <w:ind w:left="283"/>
+      </w:pPr>
+      <w:r>
+        <w:rPr>
+          <w:sz w:val="21"/>
+        </w:rPr>
+        <w:t>En la otra PC (su Kali), para entrar a ese segmento:</w:t>
+      </w:r>
+    </w:p>
+    <w:p>
+      <w:pPr>
+        <w:pStyle w:val="ListBullet"/>
+        <w:spacing w:before="20" w:after="20"/>
+        <w:ind w:left="567"/>
+      </w:pPr>
+      <w:r>
+        <w:rPr>
+          <w:sz w:val="21"/>
+        </w:rPr>
+        <w:t xml:space="preserve">Asigna una IP del rango: </w:t>
+      </w:r>
+      <w:r>
+        <w:rPr>
+          <w:rFonts w:ascii="Courier New" w:hAnsi="Courier New"/>
+          <w:color w:val="C00000"/>
+          <w:sz w:val="21"/>
+        </w:rPr>
+        <w:t>ip addr add 172.20.0.99/24 dev &lt;iface_wifi&gt;</w:t>
+      </w:r>
+      <w:r>
+        <w:rPr>
+          <w:sz w:val="21"/>
+        </w:rPr>
+        <w:t xml:space="preserve"> </w:t>
+      </w:r>
+      <w:r>
+        <w:rPr>
+          <w:b/>
+          <w:sz w:val="21"/>
+        </w:rPr>
+        <w:t>o</w:t>
+      </w:r>
+      <w:r>
+        <w:rPr>
+          <w:sz w:val="21"/>
+        </w:rPr>
+        <w:t xml:space="preserve"> deja que el switch la enrute si hay gateway.</w:t>
+      </w:r>
+    </w:p>
+    <w:p>
+      <w:pPr>
+        <w:pStyle w:val="ListBullet"/>
+        <w:spacing w:before="20" w:after="20"/>
+        <w:ind w:left="567"/>
+      </w:pPr>
+      <w:r>
+        <w:rPr>
+          <w:sz w:val="21"/>
+        </w:rPr>
+        <w:t xml:space="preserve">Ataca directamente: </w:t>
+      </w:r>
+      <w:r>
+        <w:rPr>
+          <w:rFonts w:ascii="Courier New" w:hAnsi="Courier New"/>
+          <w:color w:val="C00000"/>
+          <w:sz w:val="21"/>
+        </w:rPr>
+        <w:t>curl http://172.20.0.50/</w:t>
+      </w:r>
+      <w:r>
+        <w:rPr>
+          <w:sz w:val="21"/>
+        </w:rPr>
+        <w:t xml:space="preserve">, </w:t>
+      </w:r>
+      <w:r>
+        <w:rPr>
+          <w:rFonts w:ascii="Courier New" w:hAnsi="Courier New"/>
+          <w:color w:val="C00000"/>
+          <w:sz w:val="21"/>
+        </w:rPr>
+        <w:t>nmap 172.20.0.0/24</w:t>
+      </w:r>
+      <w:r>
+        <w:rPr>
+          <w:sz w:val="21"/>
+        </w:rPr>
+        <w:t>, etc.</w:t>
+      </w:r>
+    </w:p>
+    <w:p>
+      <w:pPr>
+        <w:spacing w:before="40" w:after="40"/>
+        <w:ind w:left="567" w:right="567"/>
+        <w:shd w:val="clear" w:color="auto" w:fill="FFF3CD"/>
+      </w:pPr>
+      <w:r>
+        <w:rPr>
+          <w:b/>
+          <w:color w:val="856604"/>
+          <w:sz w:val="20"/>
+        </w:rPr>
+        <w:t>⚠ **Advertencia:** este es el punto que falló en intentos previos ("Cloud node mal configurado"). Requiere que el Cloud apunte a la interfaz **bridged correcta** y que la otra PC esté en la misma subred L2. Es sensible a la config de VMware y del firewall. Para una demo confiable, el **Objetivo A** es más predecible.</w:t>
+      </w:r>
+    </w:p>
+    <w:p>
+      <w:pPr>
+        <w:pStyle w:val="Heading2"/>
+        <w:spacing w:before="200" w:after="40"/>
+      </w:pPr>
+      <w:r>
+        <w:rPr>
+          <w:rFonts w:ascii="Calibri" w:hAnsi="Calibri"/>
+          <w:b/>
+          <w:color w:val="1F3564"/>
+          <w:sz w:val="24"/>
+        </w:rPr>
+        <w:t>11.4 Alternativa sin Bridged — Port forwarding desde tu PC</w:t>
+      </w:r>
+    </w:p>
+    <w:p>
+      <w:pPr>
+        <w:spacing w:before="40" w:after="80"/>
+      </w:pPr>
+      <w:r>
+        <w:rPr>
+          <w:sz w:val="21"/>
+        </w:rPr>
+        <w:t xml:space="preserve">Si no quieres cambiar la red de la VM (mantener </w:t>
+      </w:r>
+      <w:r>
+        <w:rPr>
+          <w:rFonts w:ascii="Courier New" w:hAnsi="Courier New"/>
+          <w:color w:val="C00000"/>
+          <w:sz w:val="21"/>
+        </w:rPr>
+        <w:t>192.168.116.128</w:t>
+      </w:r>
+      <w:r>
+        <w:rPr>
+          <w:sz w:val="21"/>
+        </w:rPr>
+        <w:t xml:space="preserve">), tu PC Windows puede hacer de </w:t>
+      </w:r>
+      <w:r>
+        <w:rPr>
+          <w:b/>
+          <w:sz w:val="21"/>
+        </w:rPr>
+        <w:t>puente</w:t>
+      </w:r>
+      <w:r>
+        <w:rPr>
+          <w:sz w:val="21"/>
+        </w:rPr>
+        <w:t xml:space="preserve"> reenviando puertos de la WiFi hacia la VM. Útil para exponer la </w:t>
+      </w:r>
+      <w:r>
+        <w:rPr>
+          <w:b/>
+          <w:sz w:val="21"/>
+        </w:rPr>
+        <w:t>API GNS3</w:t>
+      </w:r>
+      <w:r>
+        <w:rPr>
+          <w:sz w:val="21"/>
+        </w:rPr>
+        <w:t xml:space="preserve"> o un </w:t>
+      </w:r>
+      <w:r>
+        <w:rPr>
+          <w:b/>
+          <w:sz w:val="21"/>
+        </w:rPr>
+        <w:t>servicio puntual</w:t>
+      </w:r>
+      <w:r>
+        <w:rPr>
+          <w:sz w:val="21"/>
+        </w:rPr>
+        <w:t>.</w:t>
+      </w:r>
+    </w:p>
+    <w:p>
+      <w:pPr>
+        <w:spacing w:before="40" w:after="80"/>
+      </w:pPr>
+      <w:r>
+        <w:rPr>
+          <w:sz w:val="21"/>
+        </w:rPr>
+        <w:t xml:space="preserve">En PowerShell </w:t>
+      </w:r>
+      <w:r>
+        <w:rPr>
+          <w:b/>
+          <w:sz w:val="21"/>
+        </w:rPr>
+        <w:t>como Administrador</w:t>
+      </w:r>
+      <w:r>
+        <w:rPr>
+          <w:sz w:val="21"/>
+        </w:rPr>
+        <w:t xml:space="preserve"> en tu PC:</w:t>
+      </w:r>
+    </w:p>
+    <w:p>
+      <w:pPr>
+        <w:spacing w:before="0" w:after="0"/>
+        <w:ind w:left="283"/>
+        <w:shd w:val="clear" w:color="auto" w:fill="F2F2F2"/>
+      </w:pPr>
+      <w:r>
+        <w:rPr>
+          <w:rFonts w:ascii="Courier New" w:hAnsi="Courier New"/>
+          <w:color w:val="1A1A1A"/>
+          <w:sz w:val="17"/>
+        </w:rPr>
+        <w:t># Exponer la API GNS3 (puerto 80 de la VM) en tu IP WiFi</w:t>
+      </w:r>
+    </w:p>
+    <w:p>
+      <w:pPr>
+        <w:spacing w:before="0" w:after="0"/>
+        <w:ind w:left="283"/>
+        <w:shd w:val="clear" w:color="auto" w:fill="F2F2F2"/>
+      </w:pPr>
+      <w:r>
+        <w:rPr>
+          <w:rFonts w:ascii="Courier New" w:hAnsi="Courier New"/>
+          <w:color w:val="1A1A1A"/>
+          <w:sz w:val="17"/>
+        </w:rPr>
+        <w:t>netsh interface portproxy add v4tov4 listenaddress=192.168.1.3 listenport=3080 `</w:t>
+      </w:r>
+    </w:p>
+    <w:p>
+      <w:pPr>
+        <w:spacing w:before="0" w:after="0"/>
+        <w:ind w:left="283"/>
+        <w:shd w:val="clear" w:color="auto" w:fill="F2F2F2"/>
+      </w:pPr>
+      <w:r>
+        <w:rPr>
+          <w:rFonts w:ascii="Courier New" w:hAnsi="Courier New"/>
+          <w:color w:val="1A1A1A"/>
+          <w:sz w:val="17"/>
+        </w:rPr>
+        <w:t xml:space="preserve">    connectaddress=192.168.116.128 connectport=80</w:t>
+      </w:r>
+    </w:p>
+    <w:p>
+      <w:pPr>
+        <w:spacing w:before="0" w:after="0"/>
+        <w:ind w:left="283"/>
+        <w:shd w:val="clear" w:color="auto" w:fill="F2F2F2"/>
+      </w:pPr>
+      <w:r>
+        <w:rPr>
+          <w:rFonts w:ascii="Courier New" w:hAnsi="Courier New"/>
+          <w:color w:val="1A1A1A"/>
+          <w:sz w:val="17"/>
+        </w:rPr>
+        <w:t># Abrir el puerto en el firewall</w:t>
+      </w:r>
+    </w:p>
+    <w:p>
+      <w:pPr>
+        <w:spacing w:before="0" w:after="0"/>
+        <w:ind w:left="283"/>
+        <w:shd w:val="clear" w:color="auto" w:fill="F2F2F2"/>
+      </w:pPr>
+      <w:r>
+        <w:rPr>
+          <w:rFonts w:ascii="Courier New" w:hAnsi="Courier New"/>
+          <w:color w:val="1A1A1A"/>
+          <w:sz w:val="17"/>
+        </w:rPr>
+        <w:t>New-NetFirewallRule -DisplayName "GNS3 API LAN" -Direction Inbound -Action Allow `</w:t>
+      </w:r>
+    </w:p>
+    <w:p>
+      <w:pPr>
+        <w:spacing w:before="0" w:after="0"/>
+        <w:ind w:left="283"/>
+        <w:shd w:val="clear" w:color="auto" w:fill="F2F2F2"/>
+      </w:pPr>
+      <w:r>
+        <w:rPr>
+          <w:rFonts w:ascii="Courier New" w:hAnsi="Courier New"/>
+          <w:color w:val="1A1A1A"/>
+          <w:sz w:val="17"/>
+        </w:rPr>
+        <w:t xml:space="preserve">    -Protocol TCP -LocalPort 3080</w:t>
+      </w:r>
+    </w:p>
+    <w:p>
+      <w:pPr>
+        <w:spacing w:before="0" w:after="80"/>
+      </w:pPr>
+    </w:p>
+    <w:p>
+      <w:pPr>
+        <w:spacing w:before="40" w:after="80"/>
+      </w:pPr>
+      <w:r>
+        <w:rPr>
+          <w:sz w:val="21"/>
+        </w:rPr>
+        <w:t xml:space="preserve">Desde otra PC: </w:t>
+      </w:r>
+      <w:r>
+        <w:rPr>
+          <w:rFonts w:ascii="Courier New" w:hAnsi="Courier New"/>
+          <w:color w:val="C00000"/>
+          <w:sz w:val="21"/>
+        </w:rPr>
+        <w:t>http://192.168.1.3:3080/v2/version</w:t>
+      </w:r>
+      <w:r>
+        <w:rPr>
+          <w:sz w:val="21"/>
+        </w:rPr>
+        <w:t xml:space="preserve"> llega a la API GNS3.</w:t>
+      </w:r>
+    </w:p>
+    <w:p>
+      <w:pPr>
+        <w:spacing w:before="40" w:after="80"/>
+      </w:pPr>
+      <w:r>
+        <w:rPr>
+          <w:sz w:val="21"/>
+        </w:rPr>
+        <w:t>Para deshacerlo:</w:t>
+      </w:r>
+    </w:p>
+    <w:p>
+      <w:pPr>
+        <w:spacing w:before="0" w:after="0"/>
+        <w:ind w:left="283"/>
+        <w:shd w:val="clear" w:color="auto" w:fill="F2F2F2"/>
+      </w:pPr>
+      <w:r>
+        <w:rPr>
+          <w:rFonts w:ascii="Courier New" w:hAnsi="Courier New"/>
+          <w:color w:val="1A1A1A"/>
+          <w:sz w:val="17"/>
+        </w:rPr>
+        <w:t>netsh interface portproxy delete v4tov4 listenaddress=192.168.1.3 listenport=3080</w:t>
+      </w:r>
+    </w:p>
+    <w:p>
+      <w:pPr>
+        <w:spacing w:before="0" w:after="0"/>
+        <w:ind w:left="283"/>
+        <w:shd w:val="clear" w:color="auto" w:fill="F2F2F2"/>
+      </w:pPr>
+      <w:r>
+        <w:rPr>
+          <w:rFonts w:ascii="Courier New" w:hAnsi="Courier New"/>
+          <w:color w:val="1A1A1A"/>
+          <w:sz w:val="17"/>
+        </w:rPr>
+        <w:t>Remove-NetFirewallRule -DisplayName "GNS3 API LAN"</w:t>
+      </w:r>
+    </w:p>
+    <w:p>
+      <w:pPr>
+        <w:spacing w:before="0" w:after="80"/>
+      </w:pPr>
+    </w:p>
+    <w:p>
+      <w:pPr>
+        <w:spacing w:before="40" w:after="40"/>
+        <w:ind w:left="567" w:right="567"/>
+        <w:shd w:val="clear" w:color="auto" w:fill="FFF3CD"/>
+      </w:pPr>
+      <w:r>
+        <w:rPr>
+          <w:b/>
+          <w:color w:val="856604"/>
+          <w:sz w:val="20"/>
+        </w:rPr>
+        <w:t>⚠ Exponer las **consolas** de los nodos por este método requiere reenviar también su rango de puertos (GNS3 los asigna dinámicamente, ~5000+), por lo que para GUI remoto completo el **modo Bridged (§11.2)** es más práctico.</w:t>
+      </w:r>
+    </w:p>
+    <w:p>
+      <w:pPr>
+        <w:pStyle w:val="Heading2"/>
+        <w:spacing w:before="200" w:after="40"/>
+      </w:pPr>
+      <w:r>
+        <w:rPr>
+          <w:rFonts w:ascii="Calibri" w:hAnsi="Calibri"/>
+          <w:b/>
+          <w:color w:val="1F3564"/>
+          <w:sz w:val="24"/>
+        </w:rPr>
+        <w:t>11.5 Resumen de decisión</w:t>
+      </w:r>
+    </w:p>
+    <w:tbl>
+      <w:tblPr>
+        <w:tblStyle w:val="TableGrid"/>
+        <w:tblW w:type="auto" w:w="0"/>
+        <w:jc w:val="left"/>
+        <w:tblLook w:firstColumn="1" w:firstRow="1" w:lastColumn="0" w:lastRow="0" w:noHBand="0" w:noVBand="1" w:val="04A0"/>
+      </w:tblPr>
+      <w:tblGrid>
+        <w:gridCol w:w="3135"/>
+        <w:gridCol w:w="3135"/>
+        <w:gridCol w:w="3135"/>
+      </w:tblGrid>
+      <w:tr>
+        <w:tc>
+          <w:tcPr>
+            <w:tcW w:type="dxa" w:w="3135"/>
+            <w:shd w:val="clear" w:color="auto" w:fill="1F3564"/>
+          </w:tcPr>
+          <w:p>
+            <w:r>
+              <w:rPr>
+                <w:b/>
+                <w:color w:val="FFFFFF"/>
+                <w:sz w:val="19"/>
+              </w:rPr>
+            </w:r>
+            <w:r>
+              <w:rPr>
+                <w:b/>
+                <w:color w:val="FFFFFF"/>
+                <w:sz w:val="19"/>
+              </w:rPr>
+              <w:t>Quiero que otra PC…</w:t>
+            </w:r>
+          </w:p>
+        </w:tc>
+        <w:tc>
+          <w:tcPr>
+            <w:tcW w:type="dxa" w:w="3135"/>
+            <w:shd w:val="clear" w:color="auto" w:fill="1F3564"/>
+          </w:tcPr>
+          <w:p>
+            <w:r>
+              <w:rPr>
+                <w:b/>
+                <w:color w:val="FFFFFF"/>
+                <w:sz w:val="19"/>
+              </w:rPr>
+            </w:r>
+            <w:r>
+              <w:rPr>
+                <w:b/>
+                <w:color w:val="FFFFFF"/>
+                <w:sz w:val="19"/>
+              </w:rPr>
+              <w:t>Método</w:t>
+            </w:r>
+          </w:p>
+        </w:tc>
+        <w:tc>
+          <w:tcPr>
+            <w:tcW w:type="dxa" w:w="3135"/>
+            <w:shd w:val="clear" w:color="auto" w:fill="1F3564"/>
+          </w:tcPr>
+          <w:p>
+            <w:r>
+              <w:rPr>
+                <w:b/>
+                <w:color w:val="FFFFFF"/>
+                <w:sz w:val="19"/>
+              </w:rPr>
+            </w:r>
+            <w:r>
+              <w:rPr>
+                <w:b/>
+                <w:color w:val="FFFFFF"/>
+                <w:sz w:val="19"/>
+              </w:rPr>
+              <w:t>Complejidad</w:t>
+            </w:r>
+          </w:p>
+        </w:tc>
+      </w:tr>
+      <w:tr>
+        <w:tc>
+          <w:tcPr>
+            <w:tcW w:type="dxa" w:w="3135"/>
+          </w:tcPr>
+          <w:p>
+            <w:r>
+              <w:rPr>
+                <w:sz w:val="19"/>
+              </w:rPr>
+            </w:r>
+            <w:r>
+              <w:rPr>
+                <w:sz w:val="19"/>
+              </w:rPr>
+              <w:t>Vea/opere la misma topología (colaborar)</w:t>
+            </w:r>
+          </w:p>
+        </w:tc>
+        <w:tc>
+          <w:tcPr>
+            <w:tcW w:type="dxa" w:w="3135"/>
+          </w:tcPr>
+          <w:p>
+            <w:r>
+              <w:rPr>
+                <w:sz w:val="19"/>
+              </w:rPr>
+            </w:r>
+            <w:r>
+              <w:rPr>
+                <w:sz w:val="19"/>
+              </w:rPr>
+              <w:t>§11.2 Bridged + GUI remoto</w:t>
+            </w:r>
+          </w:p>
+        </w:tc>
+        <w:tc>
+          <w:tcPr>
+            <w:tcW w:type="dxa" w:w="3135"/>
+          </w:tcPr>
+          <w:p>
+            <w:r>
+              <w:rPr>
+                <w:sz w:val="19"/>
+              </w:rPr>
+            </w:r>
+            <w:r>
+              <w:rPr>
+                <w:sz w:val="19"/>
+              </w:rPr>
+              <w:t>Baja ✅</w:t>
+            </w:r>
+          </w:p>
+        </w:tc>
+      </w:tr>
+      <w:tr>
+        <w:tc>
+          <w:tcPr>
+            <w:tcW w:type="dxa" w:w="3135"/>
+            <w:shd w:val="clear" w:color="auto" w:fill="E9EFF8"/>
+          </w:tcPr>
+          <w:p>
+            <w:r>
+              <w:rPr>
+                <w:sz w:val="19"/>
+              </w:rPr>
+            </w:r>
+            <w:r>
+              <w:rPr>
+                <w:sz w:val="19"/>
+              </w:rPr>
+              <w:t>Solo consulte la API/un servicio puntual</w:t>
+            </w:r>
+          </w:p>
+        </w:tc>
+        <w:tc>
+          <w:tcPr>
+            <w:tcW w:type="dxa" w:w="3135"/>
+            <w:shd w:val="clear" w:color="auto" w:fill="E9EFF8"/>
+          </w:tcPr>
+          <w:p>
+            <w:r>
+              <w:rPr>
+                <w:sz w:val="19"/>
+              </w:rPr>
+            </w:r>
+            <w:r>
+              <w:rPr>
+                <w:sz w:val="19"/>
+              </w:rPr>
+              <w:t>§11.4 Port forwarding</w:t>
+            </w:r>
+          </w:p>
+        </w:tc>
+        <w:tc>
+          <w:tcPr>
+            <w:tcW w:type="dxa" w:w="3135"/>
+            <w:shd w:val="clear" w:color="auto" w:fill="E9EFF8"/>
+          </w:tcPr>
+          <w:p>
+            <w:r>
+              <w:rPr>
+                <w:sz w:val="19"/>
+              </w:rPr>
+            </w:r>
+            <w:r>
+              <w:rPr>
+                <w:sz w:val="19"/>
+              </w:rPr>
+              <w:t>Baja</w:t>
+            </w:r>
+          </w:p>
+        </w:tc>
+      </w:tr>
+      <w:tr>
+        <w:tc>
+          <w:tcPr>
+            <w:tcW w:type="dxa" w:w="3135"/>
+          </w:tcPr>
+          <w:p>
+            <w:r>
+              <w:rPr>
+                <w:sz w:val="19"/>
+              </w:rPr>
+            </w:r>
+            <w:r>
+              <w:rPr>
+                <w:sz w:val="19"/>
+              </w:rPr>
+              <w:t>Ataque los servicios con su propio Kali</w:t>
+            </w:r>
+          </w:p>
+        </w:tc>
+        <w:tc>
+          <w:tcPr>
+            <w:tcW w:type="dxa" w:w="3135"/>
+          </w:tcPr>
+          <w:p>
+            <w:r>
+              <w:rPr>
+                <w:sz w:val="19"/>
+              </w:rPr>
+            </w:r>
+            <w:r>
+              <w:rPr>
+                <w:sz w:val="19"/>
+              </w:rPr>
+              <w:t>§11.3 Cloud node</w:t>
+            </w:r>
+          </w:p>
+        </w:tc>
+        <w:tc>
+          <w:tcPr>
+            <w:tcW w:type="dxa" w:w="3135"/>
+          </w:tcPr>
+          <w:p>
+            <w:r>
+              <w:rPr>
+                <w:sz w:val="19"/>
+              </w:rPr>
+            </w:r>
+            <w:r>
+              <w:rPr>
+                <w:sz w:val="19"/>
+              </w:rPr>
+              <w:t>Alta ⚠️</w:t>
+            </w:r>
+          </w:p>
+        </w:tc>
+      </w:tr>
+    </w:tbl>
+    <w:p/>
+    <w:p>
+      <w:pPr>
+        <w:pBdr>
+          <w:bottom w:val="single" w:sz="6" w:space="1" w:color="1F3564"/>
+        </w:pBdr>
+        <w:spacing w:after="80"/>
+      </w:pPr>
+    </w:p>
+    <w:p>
+      <w:pPr>
+        <w:pStyle w:val="Heading1"/>
+        <w:spacing w:before="280" w:after="80"/>
+      </w:pPr>
+      <w:r>
+        <w:rPr>
+          <w:rFonts w:ascii="Calibri" w:hAnsi="Calibri"/>
+          <w:b/>
+          <w:color w:val="1F3564"/>
+          <w:sz w:val="28"/>
+        </w:rPr>
         <w:t>Referencia rápida — IPs y credenciales</w:t>
       </w:r>
     </w:p>

</xml_diff>